<commit_message>
feat: eliminar duplicidad en _metadata.yml
</commit_message>
<xml_diff>
--- a/_site/python/2021-06-07-03-objetos-de-python/index.docx
+++ b/_site/python/2021-06-07-03-objetos-de-python/index.docx
@@ -160,7 +160,7 @@
         <w:t xml:space="preserve">: </w:t>
       </w:r>
       <w:r>
-        <w:t xml:space="preserve">conceptualización y redacción</w:t>
+        <w:t xml:space="preserve">conceptualización, metodología, análisis formal, investigación, recursos, curación de datos, redacción, visualización, supervisión, y administración del proyecto</w:t>
       </w:r>
     </w:p>
     <w:p>
@@ -168,7 +168,7 @@
         <w:pStyle w:val="BodyText"/>
       </w:pPr>
       <w:r>
-        <w:t xml:space="preserve">La correspondencia relativa a este artículo debe dirigirse a Edison Achalma, Escuela Profesional de Economía, Universidad Nacional de San Cristóbal de Huamanga, Ayacucho, AYA, Perú, Email:</w:t>
+        <w:t xml:space="preserve">La correspondencia relativa a este artículo debe dirigirse a Edison Achalma, Escuela Profesional de Economía, Universidad Nacional de San Cristóbal de Huamanga, Portal Independencia N° 57, Ayacucho, AYA 5001, Perú, Email:</w:t>
       </w:r>
       <w:r>
         <w:t xml:space="preserve"> </w:t>

</xml_diff>

<commit_message>
actualizar post de objetos python
</commit_message>
<xml_diff>
--- a/_site/python/2021-06-07-03-objetos-de-python/index.docx
+++ b/_site/python/2021-06-07-03-objetos-de-python/index.docx
@@ -202,7 +202,7 @@
         <w:pStyle w:val="AbstractFirstParagraph"/>
       </w:pPr>
       <w:r>
-        <w:t xml:space="preserve">Este abstract será actualizado una vez que se complete el contenido final del artículo.</w:t>
+        <w:t xml:space="preserve">En Python, todo es un objeto y su comportamiento está determinado por su tipo y mutabilidad. Este artículo explora los conceptos fundamentales de objetos en Python, con énfasis en la diferencia entre asignación por referencia y por valor, los principales tipos de datos built-in y el manejo práctico de las colecciones más utilizadas; listas (mutables y ordenadas), tuplas (inmutables y eficientes en memoria) y diccionarios (mutables, no ordenados y basados en claves-valor). Se presentan ejemplos claros sobre indexación, métodos principales, evaluación de membresía, copia superficial y profunda, así como consideraciones importantes de consumo de memoria y buenas prácticas al trabajar con estas estructuras.</w:t>
       </w:r>
     </w:p>
     <w:p>
@@ -217,7 +217,7 @@
         <w:t xml:space="preserve">Palabras clave</w:t>
       </w:r>
       <w:r>
-        <w:t xml:space="preserve">: keyword1, keyword2</w:t>
+        <w:t xml:space="preserve">: Objetos Python, Mutabilidad, Referencias vs copia</w:t>
       </w:r>
     </w:p>
     <w:p>

</xml_diff>